<commit_message>
Added Notice UI Block for HR before Register
</commit_message>
<xml_diff>
--- a/frontend/public/candidate-privacy-policy.docx
+++ b/frontend/public/candidate-privacy-policy.docx
@@ -176,7 +176,7 @@
           <w:b/>
           <w:bCs/>
         </w:rPr>
-        <w:t>3. AI Processing &amp; Transparency (2026 Disclosure)</w:t>
+        <w:t>3. AI Processing &amp; Transparency</w:t>
       </w:r>
     </w:p>
     <w:p>
@@ -257,6 +257,79 @@
     <w:p>
       <w:pPr>
         <w:jc w:val="both"/>
+      </w:pPr>
+      <w:r>
+        <w:rPr>
+          <w:b/>
+          <w:bCs/>
+        </w:rPr>
+        <w:t>3.1 Third-Party AI Sub-processors</w:t>
+      </w:r>
+    </w:p>
+    <w:p>
+      <w:pPr>
+        <w:jc w:val="both"/>
+      </w:pPr>
+      <w:r>
+        <w:t xml:space="preserve">To provide high-quality CV parsing and profile generation, The Company utilizes third-party Artificial Intelligence providers. </w:t>
+      </w:r>
+    </w:p>
+    <w:p>
+      <w:pPr>
+        <w:numPr>
+          <w:ilvl w:val="0"/>
+          <w:numId w:val="10"/>
+        </w:numPr>
+        <w:jc w:val="both"/>
+      </w:pPr>
+      <w:r>
+        <w:t xml:space="preserve">Specifically, your professional data is processed through </w:t>
+      </w:r>
+      <w:r>
+        <w:rPr>
+          <w:b/>
+          <w:bCs/>
+        </w:rPr>
+        <w:t>OpenRouter</w:t>
+      </w:r>
+      <w:r>
+        <w:t xml:space="preserve">, which serves as a secure gateway to Large Language Models (LLMs) including, but not limited to, </w:t>
+      </w:r>
+      <w:r>
+        <w:rPr>
+          <w:b/>
+          <w:bCs/>
+        </w:rPr>
+        <w:t>OpenAI</w:t>
+      </w:r>
+      <w:r>
+        <w:t xml:space="preserve">. </w:t>
+      </w:r>
+    </w:p>
+    <w:p>
+      <w:pPr>
+        <w:numPr>
+          <w:ilvl w:val="0"/>
+          <w:numId w:val="10"/>
+        </w:numPr>
+        <w:jc w:val="both"/>
+      </w:pPr>
+      <w:r>
+        <w:t>These sub-processors are contractually prohibited from using your personal data to train their global models and may only process your data to provide the specific parsing services requested by the Platform.</w:t>
+      </w:r>
+    </w:p>
+    <w:p>
+      <w:pPr>
+        <w:jc w:val="both"/>
+        <w:rPr>
+          <w:b/>
+          <w:bCs/>
+        </w:rPr>
+      </w:pPr>
+    </w:p>
+    <w:p>
+      <w:pPr>
+        <w:jc w:val="both"/>
         <w:rPr>
           <w:b/>
           <w:bCs/>
@@ -295,6 +368,7 @@
           <w:b/>
           <w:bCs/>
         </w:rPr>
+        <w:lastRenderedPageBreak/>
         <w:t>Direct Application:</w:t>
       </w:r>
       <w:r>
@@ -395,7 +469,6 @@
         <w:jc w:val="both"/>
       </w:pPr>
       <w:r>
-        <w:lastRenderedPageBreak/>
         <w:t>Regardless of where you live, we provide the following rights:</w:t>
       </w:r>
     </w:p>
@@ -484,7 +557,7 @@
           <w:b/>
           <w:bCs/>
         </w:rPr>
-        <w:t>support@boldgenericsolutions.com</w:t>
+        <w:t>info@boldgeneric.com</w:t>
       </w:r>
     </w:p>
     <w:p>
@@ -1548,6 +1621,119 @@
     </w:lvl>
   </w:abstractNum>
   <w:abstractNum w:abstractNumId="7" w15:restartNumberingAfterBreak="0">
+    <w:nsid w:val="566362A8"/>
+    <w:multiLevelType w:val="hybridMultilevel"/>
+    <w:tmpl w:val="01BC0052"/>
+    <w:lvl w:ilvl="0" w:tplc="AFB65D28">
+      <w:start w:val="1"/>
+      <w:numFmt w:val="bullet"/>
+      <w:lvlText w:val=""/>
+      <w:lvlJc w:val="left"/>
+      <w:pPr>
+        <w:ind w:left="720" w:hanging="360"/>
+      </w:pPr>
+      <w:rPr>
+        <w:rFonts w:ascii="Symbol" w:hAnsi="Symbol" w:hint="default"/>
+      </w:rPr>
+    </w:lvl>
+    <w:lvl w:ilvl="1" w:tplc="5AA006B6">
+      <w:start w:val="1"/>
+      <w:numFmt w:val="bullet"/>
+      <w:lvlText w:val="o"/>
+      <w:lvlJc w:val="left"/>
+      <w:pPr>
+        <w:ind w:left="1440" w:hanging="360"/>
+      </w:pPr>
+      <w:rPr>
+        <w:rFonts w:ascii="Courier New" w:hAnsi="Courier New" w:cs="Times New Roman" w:hint="default"/>
+      </w:rPr>
+    </w:lvl>
+    <w:lvl w:ilvl="2" w:tplc="BEEAB686">
+      <w:start w:val="1"/>
+      <w:numFmt w:val="bullet"/>
+      <w:lvlText w:val=""/>
+      <w:lvlJc w:val="left"/>
+      <w:pPr>
+        <w:ind w:left="2160" w:hanging="360"/>
+      </w:pPr>
+      <w:rPr>
+        <w:rFonts w:ascii="Wingdings" w:hAnsi="Wingdings" w:hint="default"/>
+      </w:rPr>
+    </w:lvl>
+    <w:lvl w:ilvl="3" w:tplc="A8728948">
+      <w:start w:val="1"/>
+      <w:numFmt w:val="bullet"/>
+      <w:lvlText w:val=""/>
+      <w:lvlJc w:val="left"/>
+      <w:pPr>
+        <w:ind w:left="2880" w:hanging="360"/>
+      </w:pPr>
+      <w:rPr>
+        <w:rFonts w:ascii="Symbol" w:hAnsi="Symbol" w:hint="default"/>
+      </w:rPr>
+    </w:lvl>
+    <w:lvl w:ilvl="4" w:tplc="0024A3E2">
+      <w:start w:val="1"/>
+      <w:numFmt w:val="bullet"/>
+      <w:lvlText w:val="o"/>
+      <w:lvlJc w:val="left"/>
+      <w:pPr>
+        <w:ind w:left="3600" w:hanging="360"/>
+      </w:pPr>
+      <w:rPr>
+        <w:rFonts w:ascii="Courier New" w:hAnsi="Courier New" w:cs="Times New Roman" w:hint="default"/>
+      </w:rPr>
+    </w:lvl>
+    <w:lvl w:ilvl="5" w:tplc="8BAA90F8">
+      <w:start w:val="1"/>
+      <w:numFmt w:val="bullet"/>
+      <w:lvlText w:val=""/>
+      <w:lvlJc w:val="left"/>
+      <w:pPr>
+        <w:ind w:left="4320" w:hanging="360"/>
+      </w:pPr>
+      <w:rPr>
+        <w:rFonts w:ascii="Wingdings" w:hAnsi="Wingdings" w:hint="default"/>
+      </w:rPr>
+    </w:lvl>
+    <w:lvl w:ilvl="6" w:tplc="11C2884A">
+      <w:start w:val="1"/>
+      <w:numFmt w:val="bullet"/>
+      <w:lvlText w:val=""/>
+      <w:lvlJc w:val="left"/>
+      <w:pPr>
+        <w:ind w:left="5040" w:hanging="360"/>
+      </w:pPr>
+      <w:rPr>
+        <w:rFonts w:ascii="Symbol" w:hAnsi="Symbol" w:hint="default"/>
+      </w:rPr>
+    </w:lvl>
+    <w:lvl w:ilvl="7" w:tplc="FECEE66E">
+      <w:start w:val="1"/>
+      <w:numFmt w:val="bullet"/>
+      <w:lvlText w:val="o"/>
+      <w:lvlJc w:val="left"/>
+      <w:pPr>
+        <w:ind w:left="5760" w:hanging="360"/>
+      </w:pPr>
+      <w:rPr>
+        <w:rFonts w:ascii="Courier New" w:hAnsi="Courier New" w:cs="Times New Roman" w:hint="default"/>
+      </w:rPr>
+    </w:lvl>
+    <w:lvl w:ilvl="8" w:tplc="A36AA47E">
+      <w:start w:val="1"/>
+      <w:numFmt w:val="bullet"/>
+      <w:lvlText w:val=""/>
+      <w:lvlJc w:val="left"/>
+      <w:pPr>
+        <w:ind w:left="6480" w:hanging="360"/>
+      </w:pPr>
+      <w:rPr>
+        <w:rFonts w:ascii="Wingdings" w:hAnsi="Wingdings" w:hint="default"/>
+      </w:rPr>
+    </w:lvl>
+  </w:abstractNum>
+  <w:abstractNum w:abstractNumId="8" w15:restartNumberingAfterBreak="0">
     <w:nsid w:val="63DB2408"/>
     <w:multiLevelType w:val="multilevel"/>
     <w:tmpl w:val="DF24EBB4"/>
@@ -1696,7 +1882,7 @@
       </w:rPr>
     </w:lvl>
   </w:abstractNum>
-  <w:abstractNum w:abstractNumId="8" w15:restartNumberingAfterBreak="0">
+  <w:abstractNum w:abstractNumId="9" w15:restartNumberingAfterBreak="0">
     <w:nsid w:val="6D6D47A3"/>
     <w:multiLevelType w:val="multilevel"/>
     <w:tmpl w:val="0F54718C"/>
@@ -1864,13 +2050,25 @@
     <w:abstractNumId w:val="1"/>
   </w:num>
   <w:num w:numId="7" w16cid:durableId="994991114">
-    <w:abstractNumId w:val="8"/>
+    <w:abstractNumId w:val="9"/>
   </w:num>
   <w:num w:numId="8" w16cid:durableId="214314753">
     <w:abstractNumId w:val="2"/>
   </w:num>
   <w:num w:numId="9" w16cid:durableId="1854999469">
+    <w:abstractNumId w:val="8"/>
+  </w:num>
+  <w:num w:numId="10" w16cid:durableId="921648797">
     <w:abstractNumId w:val="7"/>
+    <w:lvlOverride w:ilvl="0"/>
+    <w:lvlOverride w:ilvl="1"/>
+    <w:lvlOverride w:ilvl="2"/>
+    <w:lvlOverride w:ilvl="3"/>
+    <w:lvlOverride w:ilvl="4"/>
+    <w:lvlOverride w:ilvl="5"/>
+    <w:lvlOverride w:ilvl="6"/>
+    <w:lvlOverride w:ilvl="7"/>
+    <w:lvlOverride w:ilvl="8"/>
   </w:num>
 </w:numbering>
 </file>
@@ -2791,6 +2989,29 @@
       <w:spacing w:val="5"/>
     </w:rPr>
   </w:style>
+  <w:style w:type="character" w:styleId="Hyperlink">
+    <w:name w:val="Hyperlink"/>
+    <w:basedOn w:val="DefaultParagraphFont"/>
+    <w:uiPriority w:val="99"/>
+    <w:unhideWhenUsed/>
+    <w:rsid w:val="00F2373D"/>
+    <w:rPr>
+      <w:color w:val="467886" w:themeColor="hyperlink"/>
+      <w:u w:val="single"/>
+    </w:rPr>
+  </w:style>
+  <w:style w:type="character" w:styleId="UnresolvedMention">
+    <w:name w:val="Unresolved Mention"/>
+    <w:basedOn w:val="DefaultParagraphFont"/>
+    <w:uiPriority w:val="99"/>
+    <w:semiHidden/>
+    <w:unhideWhenUsed/>
+    <w:rsid w:val="00F2373D"/>
+    <w:rPr>
+      <w:color w:val="605E5C"/>
+      <w:shd w:val="clear" w:color="auto" w:fill="E1DFDD"/>
+    </w:rPr>
+  </w:style>
 </w:styles>
 </file>
 

</xml_diff>